<commit_message>
Guardar logica comercial del VPS: correlativo, KPIs, copias y Outlook.
</commit_message>
<xml_diff>
--- a/cotizaciones_api/templates/reportes/plantilla_word.docx
+++ b/cotizaciones_api/templates/reportes/plantilla_word.docx
@@ -551,7 +551,7 @@
                       <w:szCs w:val="18"/>
                       <w:lang w:val="es-PE"/>
                     </w:rPr>
-                    <w:t>Representante: {{ cabecera.atencion.nombre }}{% if cabecera.atencion.cargo %} – {{ cabecera.atencion.cargo }}{% endif %}{% endif %}{% if cabecera.atencion.telefono %}</w:t>
+                    <w:t>Representante: {{ cabecera.atencion.nombre }}{% if cabecera.atencion.cargo %} | {{ cabecera.atencion.cargo }}{% endif %}{% endif %}{% if cabecera.atencion.telefono %}</w:t>
                   </w:r>
                 </w:p>
                 <w:p>
@@ -2646,7 +2646,7 @@
           </w:tcPr>
           <w:p>
             <w:pPr>
-              <w:jc w:val="right"/>
+              <w:jc w:val="center"/>
               <w:rPr>
                 <w:rFonts w:ascii="Times New Roman" w:hAnsi="Times New Roman" w:cs="Times New Roman"/>
                 <w:color w:val="444444"/>
@@ -2684,7 +2684,7 @@
           </w:tcPr>
           <w:p>
             <w:pPr>
-              <w:jc w:val="right"/>
+              <w:jc w:val="center"/>
               <w:rPr>
                 <w:rFonts w:ascii="Times New Roman" w:hAnsi="Times New Roman" w:cs="Times New Roman"/>
                 <w:b/>
@@ -2914,7 +2914,7 @@
           </w:tcPr>
           <w:p>
             <w:pPr>
-              <w:jc w:val="right"/>
+              <w:jc w:val="center"/>
               <w:rPr>
                 <w:rFonts w:ascii="Times New Roman" w:hAnsi="Times New Roman" w:cs="Times New Roman"/>
                 <w:color w:val="444444"/>
@@ -2952,7 +2952,7 @@
           </w:tcPr>
           <w:p>
             <w:pPr>
-              <w:jc w:val="right"/>
+              <w:jc w:val="center"/>
               <w:rPr>
                 <w:rFonts w:ascii="Times New Roman" w:hAnsi="Times New Roman" w:cs="Times New Roman"/>
                 <w:b/>
@@ -3075,7 +3075,7 @@
           </w:tcPr>
           <w:p>
             <w:pPr>
-              <w:jc w:val="right"/>
+              <w:jc w:val="center"/>
               <w:rPr>
                 <w:rFonts w:ascii="Times New Roman" w:hAnsi="Times New Roman" w:cs="Times New Roman"/>
                 <w:b/>
@@ -3168,7 +3168,7 @@
           </w:tcPr>
           <w:p>
             <w:pPr>
-              <w:jc w:val="right"/>
+              <w:jc w:val="center"/>
               <w:rPr>
                 <w:rFonts w:ascii="Times New Roman" w:hAnsi="Times New Roman" w:cs="Times New Roman"/>
                 <w:b/>
@@ -3282,12 +3282,13 @@
       </w:tblPr>
       <w:tblGrid>
         <w:gridCol w:w="676"/>
-        <w:gridCol w:w="3604"/>
+        <w:gridCol w:w="1300"/>
+        <w:gridCol w:w="2304"/>
         <w:gridCol w:w="851"/>
         <w:gridCol w:w="1100"/>
+        <w:gridCol w:w="1140"/>
         <w:gridCol w:w="1700"/>
         <w:gridCol w:w="1419"/>
-        <w:gridCol w:w="1140"/>
       </w:tblGrid>
       <w:tr>
         <w:trPr>
@@ -3325,6 +3326,34 @@
         </w:tc>
         <w:tc>
           <w:tcPr>
+            <w:tcW w:w="676" w:type="dxa"/>
+            <w:tcBorders>
+              <w:bottom w:val="nil"/>
+            </w:tcBorders>
+            <w:shd w:val="clear" w:color="auto" w:fill="237573"/>
+            <w:vAlign w:val="center"/>
+          </w:tcPr>
+          <w:p>
+            <w:pPr>
+              <w:pStyle w:val="TableParagraph"/>
+              <w:jc w:val="center"/>
+              <w:rPr>
+                <w:b/>
+                <w:color w:val="FFFFFF" w:themeColor="background1"/>
+              </w:rPr>
+            </w:pPr>
+            <w:r>
+              <w:rPr>
+                <w:b/>
+                <w:color w:val="FFFFFF" w:themeColor="background1"/>
+              </w:rPr>
+              <w:lastRenderedPageBreak/>
+              <w:t>Código</w:t>
+            </w:r>
+          </w:p>
+        </w:tc>
+        <w:tc>
+          <w:tcPr>
             <w:tcW w:w="3604" w:type="dxa"/>
             <w:tcBorders>
               <w:bottom w:val="nil"/>
@@ -3346,7 +3375,7 @@
                 <w:b/>
                 <w:color w:val="FFFFFF" w:themeColor="background1"/>
               </w:rPr>
-              <w:t>Descripción del Grupo</w:t>
+              <w:t>Descripción</w:t>
             </w:r>
           </w:p>
         </w:tc>
@@ -3406,6 +3435,33 @@
         </w:tc>
         <w:tc>
           <w:tcPr>
+            <w:tcW w:w="1140" w:type="dxa"/>
+            <w:tcBorders>
+              <w:bottom w:val="nil"/>
+            </w:tcBorders>
+            <w:shd w:val="clear" w:color="auto" w:fill="237573"/>
+            <w:vAlign w:val="center"/>
+          </w:tcPr>
+          <w:p>
+            <w:pPr>
+              <w:pStyle w:val="TableParagraph"/>
+              <w:jc w:val="center"/>
+              <w:rPr>
+                <w:b/>
+                <w:color w:val="FFFFFF" w:themeColor="background1"/>
+              </w:rPr>
+            </w:pPr>
+            <w:r>
+              <w:rPr>
+                <w:b/>
+                <w:color w:val="FFFFFF" w:themeColor="background1"/>
+              </w:rPr>
+              <w:t>Entrega</w:t>
+            </w:r>
+          </w:p>
+        </w:tc>
+        <w:tc>
+          <w:tcPr>
             <w:tcW w:w="1701" w:type="dxa"/>
             <w:tcBorders>
               <w:bottom w:val="nil"/>
@@ -3480,33 +3536,6 @@
             </w:r>
           </w:p>
         </w:tc>
-        <w:tc>
-          <w:tcPr>
-            <w:tcW w:w="1140" w:type="dxa"/>
-            <w:tcBorders>
-              <w:bottom w:val="nil"/>
-            </w:tcBorders>
-            <w:shd w:val="clear" w:color="auto" w:fill="237573"/>
-            <w:vAlign w:val="center"/>
-          </w:tcPr>
-          <w:p>
-            <w:pPr>
-              <w:pStyle w:val="TableParagraph"/>
-              <w:jc w:val="center"/>
-              <w:rPr>
-                <w:b/>
-                <w:color w:val="FFFFFF" w:themeColor="background1"/>
-              </w:rPr>
-            </w:pPr>
-            <w:r>
-              <w:rPr>
-                <w:b/>
-                <w:color w:val="FFFFFF" w:themeColor="background1"/>
-              </w:rPr>
-              <w:t>Entrega</w:t>
-            </w:r>
-          </w:p>
-        </w:tc>
       </w:tr>
       <w:tr>
         <w:trPr>
@@ -3516,7 +3545,7 @@
         <w:tc>
           <w:tcPr>
             <w:tcW w:w="1140" w:type="dxa"/>
-            <w:gridSpan w:val="6"/>
+            <w:gridSpan w:val="7"/>
             <w:tcBorders>
               <w:top w:val="nil"/>
               <w:left w:val="single" w:sz="8" w:space="0" w:color="D1D5DE"/>
@@ -3585,6 +3614,37 @@
         </w:tc>
         <w:tc>
           <w:tcPr>
+            <w:tcW w:w="676" w:type="dxa"/>
+            <w:tcBorders>
+              <w:top w:val="single" w:sz="8" w:space="0" w:color="D1D5DE"/>
+              <w:left w:val="single" w:sz="8" w:space="0" w:color="D1D5DE"/>
+              <w:bottom w:val="single" w:sz="8" w:space="0" w:color="D1D5DE"/>
+              <w:right w:val="single" w:sz="8" w:space="0" w:color="D1D5DE"/>
+            </w:tcBorders>
+            <w:vAlign w:val="center"/>
+          </w:tcPr>
+          <w:p>
+            <w:pPr>
+              <w:pStyle w:val="TableParagraph"/>
+              <w:jc w:val="center"/>
+              <w:rPr>
+                <w:color w:val="444444"/>
+                <w:sz w:val="18"/>
+                <w:lang w:val="en-US"/>
+              </w:rPr>
+            </w:pPr>
+            <w:r>
+              <w:rPr>
+                <w:color w:val="444444"/>
+                <w:sz w:val="18"/>
+                <w:lang w:val="en-US"/>
+              </w:rPr>
+              <w:t>{% cellbg grupo.bg_color %} {{ item.codigo }}</w:t>
+            </w:r>
+          </w:p>
+        </w:tc>
+        <w:tc>
+          <w:tcPr>
             <w:tcW w:w="3604" w:type="dxa"/>
             <w:tcBorders>
               <w:top w:val="single" w:sz="8" w:space="0" w:color="D1D5DE"/>
@@ -3602,6 +3662,7 @@
                 <w:sz w:val="18"/>
                 <w:lang w:val="en-US"/>
               </w:rPr>
+              <w:jc w:val="left"/>
             </w:pPr>
             <w:r>
               <w:rPr>
@@ -3677,6 +3738,70 @@
         </w:tc>
         <w:tc>
           <w:tcPr>
+            <w:tcW w:w="1140" w:type="dxa"/>
+            <w:tcBorders>
+              <w:top w:val="single" w:sz="8" w:space="0" w:color="D1D5DE"/>
+              <w:left w:val="single" w:sz="8" w:space="0" w:color="D1D5DE"/>
+              <w:bottom w:val="single" w:sz="8" w:space="0" w:color="DDDDDD"/>
+              <w:right w:val="single" w:sz="8" w:space="0" w:color="D1D5DE"/>
+            </w:tcBorders>
+            <w:vAlign w:val="center"/>
+          </w:tcPr>
+          <w:p>
+            <w:pPr>
+              <w:pStyle w:val="TableParagraph"/>
+              <w:jc w:val="center"/>
+              <w:rPr>
+                <w:b/>
+                <w:color w:val="444444"/>
+                <w:sz w:val="18"/>
+                <w:lang w:val="en-US"/>
+              </w:rPr>
+            </w:pPr>
+            <w:r>
+              <w:rPr>
+                <w:color w:val="444444"/>
+                <w:sz w:val="18"/>
+                <w:lang w:val="en-US"/>
+              </w:rPr>
+              <w:t>{% cellbg grupo.bg_color %} {{ item.</w:t>
+            </w:r>
+            <w:r>
+              <w:rPr>
+                <w:color w:val="444444"/>
+                <w:sz w:val="18"/>
+                <w:lang w:val="en-US"/>
+              </w:rPr>
+              <w:t>entrega</w:t>
+            </w:r>
+            <w:r>
+              <w:rPr>
+                <w:color w:val="444444"/>
+                <w:sz w:val="18"/>
+                <w:lang w:val="en-US"/>
+              </w:rPr>
+              <w:t xml:space="preserve"> }}</w:t>
+            </w:r>
+            <w:r>
+              <w:rPr>
+                <w:color w:val="444444"/>
+                <w:sz w:val="18"/>
+                <w:lang w:val="en-US"/>
+              </w:rPr>
+              <w:t xml:space="preserve"> </w:t>
+            </w:r>
+            <w:r>
+              <w:rPr>
+                <w:color w:val="444444"/>
+                <w:sz w:val="18"/>
+                <w:lang w:val="en-US"/>
+              </w:rPr>
+              <w:t>{{ item.unidad_entrega }}</w:t>
+            </w:r>
+          </w:p>
+        </w:tc>
+        <w:tc>
+          <w:tcPr>
             <w:tcW w:w="1701" w:type="dxa"/>
             <w:tcBorders>
               <w:top w:val="single" w:sz="8" w:space="0" w:color="D1D5DE"/>
@@ -3689,7 +3814,7 @@
           <w:p>
             <w:pPr>
               <w:pStyle w:val="TableParagraph"/>
-              <w:jc w:val="right"/>
+              <w:jc w:val="center"/>
               <w:rPr>
                 <w:color w:val="444444"/>
                 <w:sz w:val="18"/>
@@ -3720,7 +3845,7 @@
           <w:p>
             <w:pPr>
               <w:pStyle w:val="TableParagraph"/>
-              <w:jc w:val="right"/>
+              <w:jc w:val="center"/>
               <w:rPr>
                 <w:color w:val="444444"/>
                 <w:sz w:val="18"/>
@@ -3735,70 +3860,6 @@
                 <w:lang w:val="en-US"/>
               </w:rPr>
               <w:t>{% cellbg grupo.bg_color %} {{ item.total_f if not grupo.total_por_grupo else '' }}</w:t>
-            </w:r>
-          </w:p>
-        </w:tc>
-        <w:tc>
-          <w:tcPr>
-            <w:tcW w:w="1140" w:type="dxa"/>
-            <w:tcBorders>
-              <w:top w:val="single" w:sz="8" w:space="0" w:color="D1D5DE"/>
-              <w:left w:val="single" w:sz="8" w:space="0" w:color="D1D5DE"/>
-              <w:bottom w:val="single" w:sz="8" w:space="0" w:color="DDDDDD"/>
-              <w:right w:val="single" w:sz="8" w:space="0" w:color="D1D5DE"/>
-            </w:tcBorders>
-            <w:vAlign w:val="center"/>
-          </w:tcPr>
-          <w:p>
-            <w:pPr>
-              <w:pStyle w:val="TableParagraph"/>
-              <w:jc w:val="right"/>
-              <w:rPr>
-                <w:b/>
-                <w:color w:val="444444"/>
-                <w:sz w:val="18"/>
-                <w:lang w:val="en-US"/>
-              </w:rPr>
-            </w:pPr>
-            <w:r>
-              <w:rPr>
-                <w:color w:val="444444"/>
-                <w:sz w:val="18"/>
-                <w:lang w:val="en-US"/>
-              </w:rPr>
-              <w:t>{% cellbg grupo.bg_color %} {{ item.</w:t>
-            </w:r>
-            <w:r>
-              <w:rPr>
-                <w:color w:val="444444"/>
-                <w:sz w:val="18"/>
-                <w:lang w:val="en-US"/>
-              </w:rPr>
-              <w:t>entrega</w:t>
-            </w:r>
-            <w:r>
-              <w:rPr>
-                <w:color w:val="444444"/>
-                <w:sz w:val="18"/>
-                <w:lang w:val="en-US"/>
-              </w:rPr>
-              <w:t xml:space="preserve"> }}</w:t>
-            </w:r>
-            <w:r>
-              <w:rPr>
-                <w:color w:val="444444"/>
-                <w:sz w:val="18"/>
-                <w:lang w:val="en-US"/>
-              </w:rPr>
-              <w:t xml:space="preserve"> </w:t>
-            </w:r>
-            <w:r>
-              <w:rPr>
-                <w:color w:val="444444"/>
-                <w:sz w:val="18"/>
-                <w:lang w:val="en-US"/>
-              </w:rPr>
-              <w:t>{{ item.unidad_entrega }}</w:t>
             </w:r>
           </w:p>
         </w:tc>
@@ -3811,7 +3872,7 @@
         <w:tc>
           <w:tcPr>
             <w:tcW w:w="1140" w:type="dxa"/>
-            <w:gridSpan w:val="6"/>
+            <w:gridSpan w:val="7"/>
             <w:tcBorders>
               <w:top w:val="single" w:sz="8" w:space="0" w:color="D1D5DE"/>
               <w:left w:val="single" w:sz="8" w:space="0" w:color="D1D5DE"/>
@@ -3849,7 +3910,7 @@
         <w:tc>
           <w:tcPr>
             <w:tcW w:w="1701" w:type="dxa"/>
-            <w:gridSpan w:val="5"/>
+            <w:gridSpan w:val="7"/>
             <w:tcBorders>
               <w:top w:val="single" w:sz="8" w:space="0" w:color="D1D5DE"/>
               <w:left w:val="single" w:sz="8" w:space="0" w:color="D1D5DE"/>
@@ -3892,7 +3953,7 @@
           <w:p>
             <w:pPr>
               <w:pStyle w:val="TableParagraph"/>
-              <w:jc w:val="right"/>
+              <w:jc w:val="center"/>
               <w:rPr>
                 <w:b/>
                 <w:color w:val="444444"/>
@@ -3906,29 +3967,6 @@
               </w:rPr>
               <w:t/>
             </w:r>
-          </w:p>
-        </w:tc>
-        <w:tc>
-          <w:tcPr>
-            <w:tcW w:w="1140" w:type="dxa"/>
-            <w:tcBorders>
-              <w:top w:val="single" w:sz="8" w:space="0" w:color="DDDDDD"/>
-              <w:left w:val="single" w:sz="8" w:space="0" w:color="D1D5DE"/>
-              <w:bottom w:val="single" w:sz="8" w:space="0" w:color="D1D5DE"/>
-              <w:right w:val="single" w:sz="8" w:space="0" w:color="D1D5DE"/>
-            </w:tcBorders>
-            <w:shd w:val="clear" w:color="auto" w:fill="F7F9FB"/>
-            <w:vAlign w:val="center"/>
-          </w:tcPr>
-          <w:p>
-            <w:pPr>
-              <w:pStyle w:val="TableParagraph"/>
-              <w:jc w:val="right"/>
-              <w:rPr>
-                <w:b/>
-                <w:color w:val="444444"/>
-              </w:rPr>
-            </w:pPr>
           </w:p>
         </w:tc>
       </w:tr>
@@ -3940,7 +3978,7 @@
         <w:tc>
           <w:tcPr>
             <w:tcW w:w="1701" w:type="dxa"/>
-            <w:gridSpan w:val="5"/>
+            <w:gridSpan w:val="7"/>
             <w:tcBorders>
               <w:top w:val="single" w:sz="8" w:space="0" w:color="D1D5DE"/>
               <w:left w:val="single" w:sz="8" w:space="0" w:color="D1D5DE"/>
@@ -3983,7 +4021,7 @@
           <w:p>
             <w:pPr>
               <w:pStyle w:val="TableParagraph"/>
-              <w:jc w:val="right"/>
+              <w:jc w:val="center"/>
               <w:rPr>
                 <w:b/>
                 <w:color w:val="444444"/>
@@ -3997,29 +4035,6 @@
               </w:rPr>
               <w:t>{{ grupo.subtotal_f }}</w:t>
             </w:r>
-          </w:p>
-        </w:tc>
-        <w:tc>
-          <w:tcPr>
-            <w:tcW w:w="1140" w:type="dxa"/>
-            <w:tcBorders>
-              <w:top w:val="single" w:sz="8" w:space="0" w:color="DDDDDD"/>
-              <w:left w:val="single" w:sz="8" w:space="0" w:color="D1D5DE"/>
-              <w:bottom w:val="single" w:sz="8" w:space="0" w:color="D1D5DE"/>
-              <w:right w:val="single" w:sz="8" w:space="0" w:color="D1D5DE"/>
-            </w:tcBorders>
-            <w:shd w:val="clear" w:color="auto" w:fill="F7F9FB"/>
-            <w:vAlign w:val="center"/>
-          </w:tcPr>
-          <w:p>
-            <w:pPr>
-              <w:pStyle w:val="TableParagraph"/>
-              <w:jc w:val="right"/>
-              <w:rPr>
-                <w:b/>
-                <w:color w:val="444444"/>
-              </w:rPr>
-            </w:pPr>
           </w:p>
         </w:tc>
       </w:tr>
@@ -4031,7 +4046,7 @@
         <w:tc>
           <w:tcPr>
             <w:tcW w:w="1701" w:type="dxa"/>
-            <w:gridSpan w:val="5"/>
+            <w:gridSpan w:val="7"/>
             <w:tcBorders>
               <w:top w:val="single" w:sz="8" w:space="0" w:color="D1D5DE"/>
               <w:left w:val="single" w:sz="8" w:space="0" w:color="D1D5DE"/>
@@ -4074,7 +4089,7 @@
           <w:p>
             <w:pPr>
               <w:pStyle w:val="TableParagraph"/>
-              <w:jc w:val="right"/>
+              <w:jc w:val="center"/>
               <w:rPr>
                 <w:b/>
                 <w:color w:val="444444"/>
@@ -4088,29 +4103,6 @@
               </w:rPr>
               <w:t/>
             </w:r>
-          </w:p>
-        </w:tc>
-        <w:tc>
-          <w:tcPr>
-            <w:tcW w:w="1140" w:type="dxa"/>
-            <w:tcBorders>
-              <w:top w:val="single" w:sz="8" w:space="0" w:color="DDDDDD"/>
-              <w:left w:val="single" w:sz="8" w:space="0" w:color="D1D5DE"/>
-              <w:bottom w:val="single" w:sz="8" w:space="0" w:color="D1D5DE"/>
-              <w:right w:val="single" w:sz="8" w:space="0" w:color="D1D5DE"/>
-            </w:tcBorders>
-            <w:shd w:val="clear" w:color="auto" w:fill="F7F9FB"/>
-            <w:vAlign w:val="center"/>
-          </w:tcPr>
-          <w:p>
-            <w:pPr>
-              <w:pStyle w:val="TableParagraph"/>
-              <w:jc w:val="right"/>
-              <w:rPr>
-                <w:b/>
-                <w:color w:val="444444"/>
-              </w:rPr>
-            </w:pPr>
           </w:p>
         </w:tc>
       </w:tr>
@@ -4122,7 +4114,7 @@
         <w:tc>
           <w:tcPr>
             <w:tcW w:w="1701" w:type="dxa"/>
-            <w:gridSpan w:val="5"/>
+            <w:gridSpan w:val="7"/>
             <w:tcBorders>
               <w:top w:val="single" w:sz="8" w:space="0" w:color="D1D5DE"/>
               <w:left w:val="single" w:sz="8" w:space="0" w:color="D1D5DE"/>
@@ -4165,7 +4157,7 @@
           <w:p>
             <w:pPr>
               <w:pStyle w:val="TableParagraph"/>
-              <w:jc w:val="right"/>
+              <w:jc w:val="center"/>
               <w:rPr>
                 <w:b/>
                 <w:color w:val="444444"/>
@@ -4179,29 +4171,6 @@
               </w:rPr>
               <w:t/>
             </w:r>
-          </w:p>
-        </w:tc>
-        <w:tc>
-          <w:tcPr>
-            <w:tcW w:w="1140" w:type="dxa"/>
-            <w:tcBorders>
-              <w:top w:val="single" w:sz="8" w:space="0" w:color="DDDDDD"/>
-              <w:left w:val="single" w:sz="8" w:space="0" w:color="D1D5DE"/>
-              <w:bottom w:val="single" w:sz="8" w:space="0" w:color="D1D5DE"/>
-              <w:right w:val="single" w:sz="8" w:space="0" w:color="D1D5DE"/>
-            </w:tcBorders>
-            <w:shd w:val="clear" w:color="auto" w:fill="F7F9FB"/>
-            <w:vAlign w:val="center"/>
-          </w:tcPr>
-          <w:p>
-            <w:pPr>
-              <w:pStyle w:val="TableParagraph"/>
-              <w:jc w:val="right"/>
-              <w:rPr>
-                <w:b/>
-                <w:color w:val="444444"/>
-              </w:rPr>
-            </w:pPr>
           </w:p>
         </w:tc>
       </w:tr>
@@ -4213,7 +4182,7 @@
         <w:tc>
           <w:tcPr>
             <w:tcW w:w="1701" w:type="dxa"/>
-            <w:gridSpan w:val="5"/>
+            <w:gridSpan w:val="7"/>
             <w:tcBorders>
               <w:top w:val="single" w:sz="8" w:space="0" w:color="D1D5DE"/>
               <w:left w:val="single" w:sz="8" w:space="0" w:color="D1D5DE"/>
@@ -4256,7 +4225,7 @@
           <w:p>
             <w:pPr>
               <w:pStyle w:val="TableParagraph"/>
-              <w:jc w:val="right"/>
+              <w:jc w:val="center"/>
               <w:rPr>
                 <w:b/>
                 <w:color w:val="444444"/>
@@ -4270,29 +4239,6 @@
               </w:rPr>
               <w:t>{{ grupo.subtotal_f }}</w:t>
             </w:r>
-          </w:p>
-        </w:tc>
-        <w:tc>
-          <w:tcPr>
-            <w:tcW w:w="1140" w:type="dxa"/>
-            <w:tcBorders>
-              <w:top w:val="single" w:sz="8" w:space="0" w:color="DDDDDD"/>
-              <w:left w:val="single" w:sz="8" w:space="0" w:color="D1D5DE"/>
-              <w:bottom w:val="single" w:sz="8" w:space="0" w:color="D1D5DE"/>
-              <w:right w:val="single" w:sz="8" w:space="0" w:color="D1D5DE"/>
-            </w:tcBorders>
-            <w:shd w:val="clear" w:color="auto" w:fill="F7F9FB"/>
-            <w:vAlign w:val="center"/>
-          </w:tcPr>
-          <w:p>
-            <w:pPr>
-              <w:pStyle w:val="TableParagraph"/>
-              <w:jc w:val="right"/>
-              <w:rPr>
-                <w:b/>
-                <w:color w:val="444444"/>
-              </w:rPr>
-            </w:pPr>
           </w:p>
         </w:tc>
       </w:tr>
@@ -4304,7 +4250,7 @@
         <w:tc>
           <w:tcPr>
             <w:tcW w:w="1701" w:type="dxa"/>
-            <w:gridSpan w:val="5"/>
+            <w:gridSpan w:val="7"/>
             <w:tcBorders>
               <w:top w:val="single" w:sz="8" w:space="0" w:color="D1D5DE"/>
               <w:left w:val="single" w:sz="8" w:space="0" w:color="D1D5DE"/>
@@ -4347,7 +4293,7 @@
           <w:p>
             <w:pPr>
               <w:pStyle w:val="TableParagraph"/>
-              <w:jc w:val="right"/>
+              <w:jc w:val="center"/>
               <w:rPr>
                 <w:b/>
                 <w:color w:val="444444"/>
@@ -4361,29 +4307,6 @@
               </w:rPr>
               <w:t>{{ grupo.total_g_f }}</w:t>
             </w:r>
-          </w:p>
-        </w:tc>
-        <w:tc>
-          <w:tcPr>
-            <w:tcW w:w="1140" w:type="dxa"/>
-            <w:tcBorders>
-              <w:top w:val="single" w:sz="8" w:space="0" w:color="DDDDDD"/>
-              <w:left w:val="single" w:sz="8" w:space="0" w:color="D1D5DE"/>
-              <w:bottom w:val="single" w:sz="8" w:space="0" w:color="D1D5DE"/>
-              <w:right w:val="single" w:sz="8" w:space="0" w:color="D1D5DE"/>
-            </w:tcBorders>
-            <w:shd w:val="clear" w:color="auto" w:fill="F7F9FB"/>
-            <w:vAlign w:val="center"/>
-          </w:tcPr>
-          <w:p>
-            <w:pPr>
-              <w:pStyle w:val="TableParagraph"/>
-              <w:jc w:val="right"/>
-              <w:rPr>
-                <w:b/>
-                <w:color w:val="444444"/>
-              </w:rPr>
-            </w:pPr>
           </w:p>
         </w:tc>
       </w:tr>
@@ -4395,7 +4318,7 @@
         <w:tc>
           <w:tcPr>
             <w:tcW w:w="1701" w:type="dxa"/>
-            <w:gridSpan w:val="5"/>
+            <w:gridSpan w:val="7"/>
             <w:tcBorders>
               <w:top w:val="single" w:sz="8" w:space="0" w:color="D1D5DE"/>
               <w:left w:val="single" w:sz="8" w:space="0" w:color="D1D5DE"/>
@@ -4438,7 +4361,7 @@
           <w:p>
             <w:pPr>
               <w:pStyle w:val="TableParagraph"/>
-              <w:jc w:val="right"/>
+              <w:jc w:val="center"/>
               <w:rPr>
                 <w:b/>
                 <w:color w:val="444444"/>
@@ -4452,29 +4375,6 @@
               </w:rPr>
               <w:t/>
             </w:r>
-          </w:p>
-        </w:tc>
-        <w:tc>
-          <w:tcPr>
-            <w:tcW w:w="1140" w:type="dxa"/>
-            <w:tcBorders>
-              <w:top w:val="single" w:sz="8" w:space="0" w:color="DDDDDD"/>
-              <w:left w:val="single" w:sz="8" w:space="0" w:color="D1D5DE"/>
-              <w:bottom w:val="single" w:sz="8" w:space="0" w:color="D1D5DE"/>
-              <w:right w:val="single" w:sz="8" w:space="0" w:color="D1D5DE"/>
-            </w:tcBorders>
-            <w:shd w:val="clear" w:color="auto" w:fill="F7F9FB"/>
-            <w:vAlign w:val="center"/>
-          </w:tcPr>
-          <w:p>
-            <w:pPr>
-              <w:pStyle w:val="TableParagraph"/>
-              <w:jc w:val="right"/>
-              <w:rPr>
-                <w:b/>
-                <w:color w:val="444444"/>
-              </w:rPr>
-            </w:pPr>
           </w:p>
         </w:tc>
       </w:tr>
@@ -4598,6 +4498,7 @@
             </w:tcBorders>
             <w:shd w:val="clear" w:color="auto" w:fill="237573"/>
             <w:vAlign w:val="center"/>
+            <w:noWrap/>
           </w:tcPr>
           <w:p>
             <w:pPr>
@@ -4625,6 +4526,7 @@
             </w:tcBorders>
             <w:shd w:val="clear" w:color="auto" w:fill="237573"/>
             <w:vAlign w:val="center"/>
+            <w:noWrap/>
           </w:tcPr>
           <w:p>
             <w:pPr>
@@ -4651,6 +4553,7 @@
             </w:tcBorders>
             <w:shd w:val="clear" w:color="auto" w:fill="237573"/>
             <w:vAlign w:val="center"/>
+            <w:noWrap/>
           </w:tcPr>
           <w:p>
             <w:pPr>
@@ -4678,6 +4581,7 @@
             </w:tcBorders>
             <w:shd w:val="clear" w:color="auto" w:fill="237573"/>
             <w:vAlign w:val="center"/>
+            <w:noWrap/>
           </w:tcPr>
           <w:p>
             <w:pPr>
@@ -4720,6 +4624,7 @@
             </w:tcBorders>
             <w:shd w:val="clear" w:color="auto" w:fill="237573"/>
             <w:vAlign w:val="center"/>
+            <w:noWrap/>
           </w:tcPr>
           <w:p>
             <w:pPr>
@@ -4770,6 +4675,7 @@
               <w:right w:val="single" w:sz="8" w:space="0" w:color="D1D5DE"/>
             </w:tcBorders>
             <w:vAlign w:val="center"/>
+            <w:noWrap/>
           </w:tcPr>
           <w:p>
             <w:pPr>
@@ -4801,6 +4707,7 @@
               <w:right w:val="single" w:sz="8" w:space="0" w:color="D1D5DE"/>
             </w:tcBorders>
             <w:vAlign w:val="center"/>
+            <w:noWrap/>
           </w:tcPr>
           <w:p>
             <w:pPr>
@@ -4836,6 +4743,7 @@
               <w:right w:val="single" w:sz="8" w:space="0" w:color="D1D5DE"/>
             </w:tcBorders>
             <w:vAlign w:val="center"/>
+            <w:noWrap/>
           </w:tcPr>
           <w:p>
             <w:pPr>
@@ -4872,11 +4780,12 @@
               <w:right w:val="single" w:sz="8" w:space="0" w:color="D1D5DE"/>
             </w:tcBorders>
             <w:vAlign w:val="center"/>
+            <w:noWrap/>
           </w:tcPr>
           <w:p>
             <w:pPr>
               <w:pStyle w:val="TableParagraph"/>
-              <w:jc w:val="right"/>
+              <w:jc w:val="center"/>
               <w:rPr>
                 <w:color w:val="444444"/>
                 <w:sz w:val="18"/>
@@ -4908,27 +4817,95 @@
               <w:right w:val="single" w:sz="8" w:space="0" w:color="D1D5DE"/>
             </w:tcBorders>
             <w:vAlign w:val="center"/>
+            <w:noWrap/>
           </w:tcPr>
           <w:p>
             <w:pPr>
               <w:pStyle w:val="TableParagraph"/>
+              <w:jc w:val="center"/>
+              <w:rPr>
+                <w:color w:val="444444"/>
+                <w:sz w:val="18"/>
+              </w:rPr>
+            </w:pPr>
+            <w:r>
+              <w:rPr>
+                <w:color w:val="444444"/>
+                <w:sz w:val="18"/>
+              </w:rPr>
+              <w:t xml:space="preserve">{% cellbg grupo.bg_color %} </w:t>
+            </w:r>
+            <w:r>
+              <w:rPr>
+                <w:color w:val="444444"/>
+                <w:sz w:val="18"/>
+              </w:rPr>
+              <w:t>{{ grupo.total_g_f }}</w:t>
+            </w:r>
+          </w:p>
+        </w:tc>
+      </w:tr>
+      <w:tr>
+        <w:tc>
+          <w:tcPr>
+            <w:tcW w:w="9053" w:type="dxa"/>
+            <w:gridSpan w:val="4"/>
+            <w:tcBorders>
+              <w:top w:val="single" w:sz="8" w:space="0" w:color="D1D5DE"/>
+              <w:left w:val="single" w:sz="8" w:space="0" w:color="D1D5DE"/>
+              <w:bottom w:val="single" w:sz="8" w:space="0" w:color="D1D5DE"/>
+              <w:right w:val="single" w:sz="8" w:space="0" w:color="D1D5DE"/>
+            </w:tcBorders>
+            <w:shd w:val="clear" w:color="auto" w:fill="F7F9FB"/>
+            <w:vAlign w:val="center"/>
+            <w:noWrap/>
+          </w:tcPr>
+          <w:p>
+            <w:pPr>
               <w:jc w:val="right"/>
               <w:rPr>
+                <w:b/>
                 <w:color w:val="444444"/>
                 <w:sz w:val="18"/>
               </w:rPr>
             </w:pPr>
             <w:r>
               <w:rPr>
+                <w:b/>
                 <w:color w:val="444444"/>
                 <w:sz w:val="18"/>
               </w:rPr>
-              <w:t xml:space="preserve">{% cellbg grupo.bg_color %} </w:t>
-            </w:r>
-            <w:r>
-              <w:rPr>
-                <w:color w:val="444444"/>
-                <w:sz w:val="18"/>
+              <w:t xml:space="preserve">COSTO TOTAL:</w:t>
+            </w:r>
+          </w:p>
+        </w:tc>
+        <w:tc>
+          <w:tcPr>
+            <w:tcW w:w="1430" w:type="dxa"/>
+            <w:tcBorders>
+              <w:top w:val="single" w:sz="8" w:space="0" w:color="D1D5DE"/>
+              <w:left w:val="single" w:sz="8" w:space="0" w:color="D1D5DE"/>
+              <w:bottom w:val="single" w:sz="8" w:space="0" w:color="D1D5DE"/>
+              <w:right w:val="single" w:sz="8" w:space="0" w:color="D1D5DE"/>
+            </w:tcBorders>
+            <w:shd w:val="clear" w:color="auto" w:fill="F7F9FB"/>
+            <w:vAlign w:val="center"/>
+            <w:noWrap/>
+          </w:tcPr>
+          <w:p>
+            <w:pPr>
+              <w:jc w:val="center"/>
+              <w:rPr>
+                <w:b/>
+                <w:color w:val="2A918E"/>
+                <w:sz w:val="20"/>
+              </w:rPr>
+            </w:pPr>
+            <w:r>
+              <w:rPr>
+                <w:b/>
+                <w:color w:val="2A918E"/>
+                <w:sz w:val="20"/>
               </w:rPr>
               <w:t>{{ grupo.total_g_f }}</w:t>
             </w:r>

</xml_diff>